<commit_message>
docs: add overall architecture and editable drawio diagrams
</commit_message>
<xml_diff>
--- a/docs/竞赛提交材料/东方航空智能营销平台_线上展示材料_20261013.docx
+++ b/docs/竞赛提交材料/东方航空智能营销平台_线上展示材料_20261013.docx
@@ -498,7 +498,7 @@
           <w:r>
             <w:fldChar w:fldCharType="separate"/>
           </w:r>
-          <w:hyperlink w:anchor="_Toc242786127" w:history="1">
+          <w:hyperlink w:anchor="_Toc242788959" w:history="1">
             <w:r>
               <w:rPr>
                 <w:rStyle w:val="63"/>
@@ -554,7 +554,7 @@
                 <w:noProof/>
                 <w:webHidden/>
               </w:rPr>
-              <w:instrText>PAGEREF _Toc242786127 \h</w:instrText>
+              <w:instrText>PAGEREF _Toc242788959 \h</w:instrText>
             </w:r>
             <w:r>
               <w:rPr>
@@ -609,7 +609,7 @@
               <w14:ligatures w14:val="standardContextual"/>
             </w:rPr>
           </w:pPr>
-          <w:hyperlink w:anchor="_Toc242786128" w:history="1">
+          <w:hyperlink w:anchor="_Toc242788960" w:history="1">
             <w:r>
               <w:rPr>
                 <w:rStyle w:val="63"/>
@@ -664,7 +664,7 @@
                 <w:noProof/>
                 <w:webHidden/>
               </w:rPr>
-              <w:instrText>PAGEREF _Toc242786128 \h</w:instrText>
+              <w:instrText>PAGEREF _Toc242788960 \h</w:instrText>
             </w:r>
             <w:r>
               <w:rPr>
@@ -719,7 +719,7 @@
               <w14:ligatures w14:val="standardContextual"/>
             </w:rPr>
           </w:pPr>
-          <w:hyperlink w:anchor="_Toc242786129" w:history="1">
+          <w:hyperlink w:anchor="_Toc242788961" w:history="1">
             <w:r>
               <w:rPr>
                 <w:rStyle w:val="63"/>
@@ -774,7 +774,7 @@
                 <w:noProof/>
                 <w:webHidden/>
               </w:rPr>
-              <w:instrText>PAGEREF _Toc242786129 \h</w:instrText>
+              <w:instrText>PAGEREF _Toc242788961 \h</w:instrText>
             </w:r>
             <w:r>
               <w:rPr>
@@ -829,7 +829,7 @@
               <w14:ligatures w14:val="standardContextual"/>
             </w:rPr>
           </w:pPr>
-          <w:hyperlink w:anchor="_Toc242786130" w:history="1">
+          <w:hyperlink w:anchor="_Toc242788962" w:history="1">
             <w:r>
               <w:rPr>
                 <w:rStyle w:val="63"/>
@@ -884,7 +884,7 @@
                 <w:noProof/>
                 <w:webHidden/>
               </w:rPr>
-              <w:instrText>PAGEREF _Toc242786130 \h</w:instrText>
+              <w:instrText>PAGEREF _Toc242788962 \h</w:instrText>
             </w:r>
             <w:r>
               <w:rPr>
@@ -913,7 +913,7 @@
                 <w:noProof/>
                 <w:webHidden/>
               </w:rPr>
-              <w:t>2</w:t>
+              <w:t>3</w:t>
             </w:r>
             <w:r>
               <w:rPr>
@@ -937,7 +937,7 @@
               <w14:ligatures w14:val="standardContextual"/>
             </w:rPr>
           </w:pPr>
-          <w:hyperlink w:anchor="_Toc242786131" w:history="1">
+          <w:hyperlink w:anchor="_Toc242788963" w:history="1">
             <w:r>
               <w:rPr>
                 <w:rStyle w:val="63"/>
@@ -993,7 +993,7 @@
                 <w:noProof/>
                 <w:webHidden/>
               </w:rPr>
-              <w:instrText>PAGEREF _Toc242786131 \h</w:instrText>
+              <w:instrText>PAGEREF _Toc242788963 \h</w:instrText>
             </w:r>
             <w:r>
               <w:rPr>
@@ -1022,7 +1022,7 @@
                 <w:noProof/>
                 <w:webHidden/>
               </w:rPr>
-              <w:t>2</w:t>
+              <w:t>3</w:t>
             </w:r>
             <w:r>
               <w:rPr>
@@ -1048,7 +1048,7 @@
               <w14:ligatures w14:val="standardContextual"/>
             </w:rPr>
           </w:pPr>
-          <w:hyperlink w:anchor="_Toc242786132" w:history="1">
+          <w:hyperlink w:anchor="_Toc242788964" w:history="1">
             <w:r>
               <w:rPr>
                 <w:rStyle w:val="63"/>
@@ -1103,7 +1103,7 @@
                 <w:noProof/>
                 <w:webHidden/>
               </w:rPr>
-              <w:instrText>PAGEREF _Toc242786132 \h</w:instrText>
+              <w:instrText>PAGEREF _Toc242788964 \h</w:instrText>
             </w:r>
             <w:r>
               <w:rPr>
@@ -1132,7 +1132,7 @@
                 <w:noProof/>
                 <w:webHidden/>
               </w:rPr>
-              <w:t>2</w:t>
+              <w:t>3</w:t>
             </w:r>
             <w:r>
               <w:rPr>
@@ -1158,7 +1158,7 @@
               <w14:ligatures w14:val="standardContextual"/>
             </w:rPr>
           </w:pPr>
-          <w:hyperlink w:anchor="_Toc242786133" w:history="1">
+          <w:hyperlink w:anchor="_Toc242788965" w:history="1">
             <w:r>
               <w:rPr>
                 <w:rStyle w:val="63"/>
@@ -1213,7 +1213,7 @@
                 <w:noProof/>
                 <w:webHidden/>
               </w:rPr>
-              <w:instrText>PAGEREF _Toc242786133 \h</w:instrText>
+              <w:instrText>PAGEREF _Toc242788965 \h</w:instrText>
             </w:r>
             <w:r>
               <w:rPr>
@@ -1242,7 +1242,7 @@
                 <w:noProof/>
                 <w:webHidden/>
               </w:rPr>
-              <w:t>2</w:t>
+              <w:t>4</w:t>
             </w:r>
             <w:r>
               <w:rPr>
@@ -1266,7 +1266,7 @@
               <w14:ligatures w14:val="standardContextual"/>
             </w:rPr>
           </w:pPr>
-          <w:hyperlink w:anchor="_Toc242786134" w:history="1">
+          <w:hyperlink w:anchor="_Toc242788966" w:history="1">
             <w:r>
               <w:rPr>
                 <w:rStyle w:val="63"/>
@@ -1322,7 +1322,7 @@
                 <w:noProof/>
                 <w:webHidden/>
               </w:rPr>
-              <w:instrText>PAGEREF _Toc242786134 \h</w:instrText>
+              <w:instrText>PAGEREF _Toc242788966 \h</w:instrText>
             </w:r>
             <w:r>
               <w:rPr>
@@ -1351,7 +1351,7 @@
                 <w:noProof/>
                 <w:webHidden/>
               </w:rPr>
-              <w:t>3</w:t>
+              <w:t>5</w:t>
             </w:r>
             <w:r>
               <w:rPr>
@@ -1377,7 +1377,7 @@
               <w14:ligatures w14:val="standardContextual"/>
             </w:rPr>
           </w:pPr>
-          <w:hyperlink w:anchor="_Toc242786135" w:history="1">
+          <w:hyperlink w:anchor="_Toc242788967" w:history="1">
             <w:r>
               <w:rPr>
                 <w:rStyle w:val="63"/>
@@ -1432,7 +1432,7 @@
                 <w:noProof/>
                 <w:webHidden/>
               </w:rPr>
-              <w:instrText>PAGEREF _Toc242786135 \h</w:instrText>
+              <w:instrText>PAGEREF _Toc242788967 \h</w:instrText>
             </w:r>
             <w:r>
               <w:rPr>
@@ -1461,7 +1461,7 @@
                 <w:noProof/>
                 <w:webHidden/>
               </w:rPr>
-              <w:t>3</w:t>
+              <w:t>5</w:t>
             </w:r>
             <w:r>
               <w:rPr>
@@ -1487,7 +1487,7 @@
               <w14:ligatures w14:val="standardContextual"/>
             </w:rPr>
           </w:pPr>
-          <w:hyperlink w:anchor="_Toc242786136" w:history="1">
+          <w:hyperlink w:anchor="_Toc242788968" w:history="1">
             <w:r>
               <w:rPr>
                 <w:rStyle w:val="63"/>
@@ -1542,7 +1542,7 @@
                 <w:noProof/>
                 <w:webHidden/>
               </w:rPr>
-              <w:instrText>PAGEREF _Toc242786136 \h</w:instrText>
+              <w:instrText>PAGEREF _Toc242788968 \h</w:instrText>
             </w:r>
             <w:r>
               <w:rPr>
@@ -1571,7 +1571,7 @@
                 <w:noProof/>
                 <w:webHidden/>
               </w:rPr>
-              <w:t>4</w:t>
+              <w:t>5</w:t>
             </w:r>
             <w:r>
               <w:rPr>
@@ -1597,7 +1597,7 @@
               <w14:ligatures w14:val="standardContextual"/>
             </w:rPr>
           </w:pPr>
-          <w:hyperlink w:anchor="_Toc242786137" w:history="1">
+          <w:hyperlink w:anchor="_Toc242788969" w:history="1">
             <w:r>
               <w:rPr>
                 <w:rStyle w:val="63"/>
@@ -1652,7 +1652,7 @@
                 <w:noProof/>
                 <w:webHidden/>
               </w:rPr>
-              <w:instrText>PAGEREF _Toc242786137 \h</w:instrText>
+              <w:instrText>PAGEREF _Toc242788969 \h</w:instrText>
             </w:r>
             <w:r>
               <w:rPr>
@@ -1681,7 +1681,7 @@
                 <w:noProof/>
                 <w:webHidden/>
               </w:rPr>
-              <w:t>4</w:t>
+              <w:t>6</w:t>
             </w:r>
             <w:r>
               <w:rPr>
@@ -1705,7 +1705,7 @@
               <w14:ligatures w14:val="standardContextual"/>
             </w:rPr>
           </w:pPr>
-          <w:hyperlink w:anchor="_Toc242786138" w:history="1">
+          <w:hyperlink w:anchor="_Toc242788970" w:history="1">
             <w:r>
               <w:rPr>
                 <w:rStyle w:val="63"/>
@@ -1761,7 +1761,7 @@
                 <w:noProof/>
                 <w:webHidden/>
               </w:rPr>
-              <w:instrText>PAGEREF _Toc242786138 \h</w:instrText>
+              <w:instrText>PAGEREF _Toc242788970 \h</w:instrText>
             </w:r>
             <w:r>
               <w:rPr>
@@ -1790,7 +1790,7 @@
                 <w:noProof/>
                 <w:webHidden/>
               </w:rPr>
-              <w:t>5</w:t>
+              <w:t>6</w:t>
             </w:r>
             <w:r>
               <w:rPr>
@@ -2170,7 +2170,7 @@
         <w:spacing w:line="360" w:lineRule="auto"/>
         <w:ind w:firstLine="0"/>
       </w:pPr>
-      <w:bookmarkStart w:id="0" w:name="_Toc242786127"/>
+      <w:bookmarkStart w:id="0" w:name="_Toc242788959"/>
       <w:r>
         <w:lastRenderedPageBreak/>
         <w:t>项目概况</w:t>
@@ -2183,7 +2183,7 @@
         <w:spacing w:line="360" w:lineRule="auto"/>
         <w:ind w:firstLine="0"/>
       </w:pPr>
-      <w:bookmarkStart w:id="1" w:name="_Toc242786128"/>
+      <w:bookmarkStart w:id="1" w:name="_Toc242788960"/>
       <w:r>
         <w:t>背景和基础</w:t>
       </w:r>
@@ -2280,7 +2280,7 @@
         <w:spacing w:line="360" w:lineRule="auto"/>
         <w:ind w:firstLine="0"/>
       </w:pPr>
-      <w:bookmarkStart w:id="2" w:name="_Toc242786129"/>
+      <w:bookmarkStart w:id="2" w:name="_Toc242788961"/>
       <w:r>
         <w:t>场景和价值</w:t>
       </w:r>
@@ -2332,10 +2332,74 @@
         </w:rPr>
         <w:lastRenderedPageBreak/>
         <w:drawing>
-          <wp:inline distT="0" distB="0" distL="0" distR="0" wp14:anchorId="2A9AE687" wp14:editId="138A9540">
-            <wp:extent cx="5274000" cy="3296250"/>
+          <wp:inline distT="0" distB="0" distL="0" distR="0" wp14:anchorId="36B814E2" wp14:editId="4F05E28A">
+            <wp:extent cx="5274000" cy="5966212"/>
             <wp:effectExtent l="0" t="0" r="0" b="0"/>
             <wp:docPr id="1" name="Picture 1"/>
+            <wp:cNvGraphicFramePr>
+              <a:graphicFrameLocks xmlns:a="http://schemas.openxmlformats.org/drawingml/2006/main" noChangeAspect="1"/>
+            </wp:cNvGraphicFramePr>
+            <a:graphic xmlns:a="http://schemas.openxmlformats.org/drawingml/2006/main">
+              <a:graphicData uri="http://schemas.openxmlformats.org/drawingml/2006/picture">
+                <pic:pic xmlns:pic="http://schemas.openxmlformats.org/drawingml/2006/picture">
+                  <pic:nvPicPr>
+                    <pic:cNvPr id="0" name="overall.png"/>
+                    <pic:cNvPicPr/>
+                  </pic:nvPicPr>
+                  <pic:blipFill>
+                    <a:blip r:embed="rId12"/>
+                    <a:stretch>
+                      <a:fillRect/>
+                    </a:stretch>
+                  </pic:blipFill>
+                  <pic:spPr>
+                    <a:xfrm>
+                      <a:off x="0" y="0"/>
+                      <a:ext cx="5274000" cy="5966212"/>
+                    </a:xfrm>
+                    <a:prstGeom prst="rect">
+                      <a:avLst/>
+                    </a:prstGeom>
+                  </pic:spPr>
+                </pic:pic>
+              </a:graphicData>
+            </a:graphic>
+          </wp:inline>
+        </w:drawing>
+      </w:r>
+    </w:p>
+    <w:p>
+      <w:pPr>
+        <w:pStyle w:val="13"/>
+        <w:spacing w:before="80" w:after="140" w:line="288" w:lineRule="auto"/>
+        <w:jc w:val="center"/>
+      </w:pPr>
+      <w:r>
+        <w:t>图</w:t>
+      </w:r>
+      <w:r>
+        <w:t xml:space="preserve"> 1  </w:t>
+      </w:r>
+      <w:r>
+        <w:t>平台总体架构</w:t>
+      </w:r>
+    </w:p>
+    <w:p>
+      <w:pPr>
+        <w:keepNext/>
+        <w:spacing w:before="120"/>
+        <w:jc w:val="center"/>
+      </w:pPr>
+      <w:r>
+        <w:rPr>
+          <w:noProof/>
+        </w:rPr>
+        <w:lastRenderedPageBreak/>
+        <w:drawing>
+          <wp:inline distT="0" distB="0" distL="0" distR="0" wp14:anchorId="2FD0AA11" wp14:editId="73191129">
+            <wp:extent cx="5274000" cy="4647712"/>
+            <wp:effectExtent l="0" t="0" r="0" b="0"/>
+            <wp:docPr id="2" name="Picture 2"/>
             <wp:cNvGraphicFramePr>
               <a:graphicFrameLocks xmlns:a="http://schemas.openxmlformats.org/drawingml/2006/main" noChangeAspect="1"/>
             </wp:cNvGraphicFramePr>
@@ -2347,7 +2411,7 @@
                     <pic:cNvPicPr/>
                   </pic:nvPicPr>
                   <pic:blipFill>
-                    <a:blip r:embed="rId12"/>
+                    <a:blip r:embed="rId13"/>
                     <a:stretch>
                       <a:fillRect/>
                     </a:stretch>
@@ -2355,7 +2419,7 @@
                   <pic:spPr>
                     <a:xfrm>
                       <a:off x="0" y="0"/>
-                      <a:ext cx="5274000" cy="3296250"/>
+                      <a:ext cx="5274000" cy="4647712"/>
                     </a:xfrm>
                     <a:prstGeom prst="rect">
                       <a:avLst/>
@@ -2378,10 +2442,10 @@
         <w:t>图</w:t>
       </w:r>
       <w:r>
-        <w:t xml:space="preserve"> 1  </w:t>
-      </w:r>
-      <w:r>
-        <w:t>平台分层技术架构</w:t>
+        <w:t xml:space="preserve"> 2  </w:t>
+      </w:r>
+      <w:r>
+        <w:t>平台分层架构与跨层控制</w:t>
       </w:r>
     </w:p>
     <w:p>
@@ -2390,7 +2454,7 @@
         <w:spacing w:line="360" w:lineRule="auto"/>
         <w:ind w:firstLine="0"/>
       </w:pPr>
-      <w:bookmarkStart w:id="3" w:name="_Toc242786130"/>
+      <w:bookmarkStart w:id="3" w:name="_Toc242788962"/>
       <w:r>
         <w:t>所需支持</w:t>
       </w:r>
@@ -2418,7 +2482,7 @@
         <w:spacing w:line="360" w:lineRule="auto"/>
         <w:ind w:firstLine="0"/>
       </w:pPr>
-      <w:bookmarkStart w:id="4" w:name="_Toc242786131"/>
+      <w:bookmarkStart w:id="4" w:name="_Toc242788963"/>
       <w:r>
         <w:t>项目规划</w:t>
       </w:r>
@@ -2430,7 +2494,7 @@
         <w:spacing w:line="360" w:lineRule="auto"/>
         <w:ind w:firstLine="0"/>
       </w:pPr>
-      <w:bookmarkStart w:id="5" w:name="_Toc242786132"/>
+      <w:bookmarkStart w:id="5" w:name="_Toc242788964"/>
       <w:r>
         <w:t>整体目标</w:t>
       </w:r>
@@ -2452,8 +2516,9 @@
         <w:spacing w:line="360" w:lineRule="auto"/>
         <w:ind w:firstLine="0"/>
       </w:pPr>
-      <w:bookmarkStart w:id="6" w:name="_Toc242786133"/>
-      <w:r>
+      <w:bookmarkStart w:id="6" w:name="_Toc242788965"/>
+      <w:r>
+        <w:lastRenderedPageBreak/>
         <w:t>技术创新点</w:t>
       </w:r>
       <w:bookmarkEnd w:id="6"/>
@@ -2484,12 +2549,11 @@
         <w:rPr>
           <w:noProof/>
         </w:rPr>
-        <w:lastRenderedPageBreak/>
         <w:drawing>
-          <wp:inline distT="0" distB="0" distL="0" distR="0" wp14:anchorId="468C6150" wp14:editId="127E0239">
-            <wp:extent cx="5274000" cy="3340200"/>
+          <wp:inline distT="0" distB="0" distL="0" distR="0" wp14:anchorId="23B43A92" wp14:editId="5437C370">
+            <wp:extent cx="5274000" cy="5372888"/>
             <wp:effectExtent l="0" t="0" r="0" b="0"/>
-            <wp:docPr id="2" name="Picture 2"/>
+            <wp:docPr id="3" name="Picture 3"/>
             <wp:cNvGraphicFramePr>
               <a:graphicFrameLocks xmlns:a="http://schemas.openxmlformats.org/drawingml/2006/main" noChangeAspect="1"/>
             </wp:cNvGraphicFramePr>
@@ -2501,7 +2565,7 @@
                     <pic:cNvPicPr/>
                   </pic:nvPicPr>
                   <pic:blipFill>
-                    <a:blip r:embed="rId13"/>
+                    <a:blip r:embed="rId14"/>
                     <a:stretch>
                       <a:fillRect/>
                     </a:stretch>
@@ -2509,7 +2573,7 @@
                   <pic:spPr>
                     <a:xfrm>
                       <a:off x="0" y="0"/>
-                      <a:ext cx="5274000" cy="3340200"/>
+                      <a:ext cx="5274000" cy="5372888"/>
                     </a:xfrm>
                     <a:prstGeom prst="rect">
                       <a:avLst/>
@@ -2532,7 +2596,7 @@
         <w:t>图</w:t>
       </w:r>
       <w:r>
-        <w:t xml:space="preserve"> 2  </w:t>
+        <w:t xml:space="preserve"> 3  </w:t>
       </w:r>
       <w:r>
         <w:t>航空供给与营销本体关系</w:t>
@@ -2544,8 +2608,9 @@
         <w:spacing w:line="360" w:lineRule="auto"/>
         <w:ind w:firstLine="0"/>
       </w:pPr>
-      <w:bookmarkStart w:id="7" w:name="_Toc242786134"/>
-      <w:r>
+      <w:bookmarkStart w:id="7" w:name="_Toc242788966"/>
+      <w:r>
+        <w:lastRenderedPageBreak/>
         <w:t>实施方案</w:t>
       </w:r>
       <w:bookmarkEnd w:id="7"/>
@@ -2556,7 +2621,7 @@
         <w:spacing w:line="360" w:lineRule="auto"/>
         <w:ind w:firstLine="0"/>
       </w:pPr>
-      <w:bookmarkStart w:id="8" w:name="_Toc242786135"/>
+      <w:bookmarkStart w:id="8" w:name="_Toc242788967"/>
       <w:r>
         <w:t>技术可行性分析</w:t>
       </w:r>
@@ -2620,9 +2685,8 @@
         <w:spacing w:line="360" w:lineRule="auto"/>
         <w:ind w:firstLine="0"/>
       </w:pPr>
-      <w:bookmarkStart w:id="9" w:name="_Toc242786136"/>
-      <w:r>
-        <w:lastRenderedPageBreak/>
+      <w:bookmarkStart w:id="9" w:name="_Toc242788968"/>
+      <w:r>
         <w:t>技术细节</w:t>
       </w:r>
       <w:bookmarkEnd w:id="9"/>
@@ -2638,10 +2702,10 @@
           <w:noProof/>
         </w:rPr>
         <w:drawing>
-          <wp:inline distT="0" distB="0" distL="0" distR="0" wp14:anchorId="0727F51D" wp14:editId="22F31A0D">
+          <wp:inline distT="0" distB="0" distL="0" distR="0" wp14:anchorId="7A5175B4" wp14:editId="221D6850">
             <wp:extent cx="5274000" cy="2307375"/>
             <wp:effectExtent l="0" t="0" r="0" b="0"/>
-            <wp:docPr id="3" name="Picture 3"/>
+            <wp:docPr id="4" name="Picture 4"/>
             <wp:cNvGraphicFramePr>
               <a:graphicFrameLocks xmlns:a="http://schemas.openxmlformats.org/drawingml/2006/main" noChangeAspect="1"/>
             </wp:cNvGraphicFramePr>
@@ -2653,7 +2717,7 @@
                     <pic:cNvPicPr/>
                   </pic:nvPicPr>
                   <pic:blipFill>
-                    <a:blip r:embed="rId14"/>
+                    <a:blip r:embed="rId15"/>
                     <a:stretch>
                       <a:fillRect/>
                     </a:stretch>
@@ -2684,7 +2748,7 @@
         <w:t>图</w:t>
       </w:r>
       <w:r>
-        <w:t xml:space="preserve"> 3  </w:t>
+        <w:t xml:space="preserve"> 4  </w:t>
       </w:r>
       <w:r>
         <w:t>家庭场景的资格漏斗</w:t>
@@ -3204,8 +3268,9 @@
         <w:spacing w:line="360" w:lineRule="auto"/>
         <w:ind w:firstLine="0"/>
       </w:pPr>
-      <w:bookmarkStart w:id="10" w:name="_Toc242786137"/>
-      <w:r>
+      <w:bookmarkStart w:id="10" w:name="_Toc242788969"/>
+      <w:r>
+        <w:lastRenderedPageBreak/>
         <w:t>计划和分工</w:t>
       </w:r>
       <w:bookmarkEnd w:id="10"/>
@@ -3256,9 +3321,8 @@
         <w:spacing w:line="360" w:lineRule="auto"/>
         <w:ind w:firstLine="0"/>
       </w:pPr>
-      <w:bookmarkStart w:id="11" w:name="_Toc242786138"/>
-      <w:r>
-        <w:lastRenderedPageBreak/>
+      <w:bookmarkStart w:id="11" w:name="_Toc242788970"/>
+      <w:r>
         <w:t>参考资料</w:t>
       </w:r>
       <w:bookmarkEnd w:id="11"/>

</xml_diff>